<commit_message>
Document the Collection normalization stages and C4 verification
Co-Authored-By: Claude Fable 5.1 <noreply@anthropic.com>
</commit_message>
<xml_diff>
--- a/docs/application/COLLECTION_PROCESS_FLOW_AND_NARRATIVE.docx
+++ b/docs/application/COLLECTION_PROCESS_FLOW_AND_NARRATIVE.docx
@@ -70,12 +70,6 @@
         <w:gridCol w:w="6360"/>
       </w:tblGrid>
       <w:tr>
-        <w:tblPrEx>
-          <w:tblCellMar>
-            <w:top w:w="0" w:type="dxa"/>
-            <w:bottom w:w="0" w:type="dxa"/>
-          </w:tblCellMar>
-        </w:tblPrEx>
         <w:tc>
           <w:tcPr>
             <w:tcW w:w="3000" w:type="dxa"/>
@@ -134,12 +128,6 @@
         </w:tc>
       </w:tr>
       <w:tr>
-        <w:tblPrEx>
-          <w:tblCellMar>
-            <w:top w:w="0" w:type="dxa"/>
-            <w:bottom w:w="0" w:type="dxa"/>
-          </w:tblCellMar>
-        </w:tblPrEx>
         <w:tc>
           <w:tcPr>
             <w:tcW w:w="3000" w:type="dxa"/>
@@ -205,12 +193,6 @@
         </w:tc>
       </w:tr>
       <w:tr>
-        <w:tblPrEx>
-          <w:tblCellMar>
-            <w:top w:w="0" w:type="dxa"/>
-            <w:bottom w:w="0" w:type="dxa"/>
-          </w:tblCellMar>
-        </w:tblPrEx>
         <w:tc>
           <w:tcPr>
             <w:tcW w:w="3000" w:type="dxa"/>
@@ -269,12 +251,6 @@
         </w:tc>
       </w:tr>
       <w:tr>
-        <w:tblPrEx>
-          <w:tblCellMar>
-            <w:top w:w="0" w:type="dxa"/>
-            <w:bottom w:w="0" w:type="dxa"/>
-          </w:tblCellMar>
-        </w:tblPrEx>
         <w:tc>
           <w:tcPr>
             <w:tcW w:w="3000" w:type="dxa"/>
@@ -340,12 +316,6 @@
         </w:tc>
       </w:tr>
       <w:tr>
-        <w:tblPrEx>
-          <w:tblCellMar>
-            <w:top w:w="0" w:type="dxa"/>
-            <w:bottom w:w="0" w:type="dxa"/>
-          </w:tblCellMar>
-        </w:tblPrEx>
         <w:tc>
           <w:tcPr>
             <w:tcW w:w="3000" w:type="dxa"/>
@@ -411,12 +381,6 @@
         </w:tc>
       </w:tr>
       <w:tr>
-        <w:tblPrEx>
-          <w:tblCellMar>
-            <w:top w:w="0" w:type="dxa"/>
-            <w:bottom w:w="0" w:type="dxa"/>
-          </w:tblCellMar>
-        </w:tblPrEx>
         <w:tc>
           <w:tcPr>
             <w:tcW w:w="3000" w:type="dxa"/>
@@ -482,12 +446,6 @@
         </w:tc>
       </w:tr>
       <w:tr>
-        <w:tblPrEx>
-          <w:tblCellMar>
-            <w:top w:w="0" w:type="dxa"/>
-            <w:bottom w:w="0" w:type="dxa"/>
-          </w:tblCellMar>
-        </w:tblPrEx>
         <w:tc>
           <w:tcPr>
             <w:tcW w:w="3000" w:type="dxa"/>
@@ -545,16 +503,13 @@
             <w:r>
               <w:t>Jay Bryan C. Abaoag</w:t>
             </w:r>
+            <w:r>
+              <w:t xml:space="preserve"> and Carl Jeremiah C. Bartolome</w:t>
+            </w:r>
           </w:p>
         </w:tc>
       </w:tr>
       <w:tr>
-        <w:tblPrEx>
-          <w:tblCellMar>
-            <w:top w:w="0" w:type="dxa"/>
-            <w:bottom w:w="0" w:type="dxa"/>
-          </w:tblCellMar>
-        </w:tblPrEx>
         <w:tc>
           <w:tcPr>
             <w:tcW w:w="3000" w:type="dxa"/>
@@ -613,12 +568,6 @@
         </w:tc>
       </w:tr>
       <w:tr>
-        <w:tblPrEx>
-          <w:tblCellMar>
-            <w:top w:w="0" w:type="dxa"/>
-            <w:bottom w:w="0" w:type="dxa"/>
-          </w:tblCellMar>
-        </w:tblPrEx>
         <w:tc>
           <w:tcPr>
             <w:tcW w:w="3000" w:type="dxa"/>
@@ -2294,12 +2243,6 @@
         <w:gridCol w:w="6760"/>
       </w:tblGrid>
       <w:tr>
-        <w:tblPrEx>
-          <w:tblCellMar>
-            <w:top w:w="0" w:type="dxa"/>
-            <w:bottom w:w="0" w:type="dxa"/>
-          </w:tblCellMar>
-        </w:tblPrEx>
         <w:trPr>
           <w:cantSplit/>
           <w:tblHeader/>
@@ -2374,12 +2317,6 @@
         </w:tc>
       </w:tr>
       <w:tr>
-        <w:tblPrEx>
-          <w:tblCellMar>
-            <w:top w:w="0" w:type="dxa"/>
-            <w:bottom w:w="0" w:type="dxa"/>
-          </w:tblCellMar>
-        </w:tblPrEx>
         <w:trPr>
           <w:cantSplit/>
         </w:trPr>
@@ -2461,12 +2398,6 @@
         </w:tc>
       </w:tr>
       <w:tr>
-        <w:tblPrEx>
-          <w:tblCellMar>
-            <w:top w:w="0" w:type="dxa"/>
-            <w:bottom w:w="0" w:type="dxa"/>
-          </w:tblCellMar>
-        </w:tblPrEx>
         <w:trPr>
           <w:cantSplit/>
         </w:trPr>
@@ -2534,12 +2465,6 @@
         </w:tc>
       </w:tr>
       <w:tr>
-        <w:tblPrEx>
-          <w:tblCellMar>
-            <w:top w:w="0" w:type="dxa"/>
-            <w:bottom w:w="0" w:type="dxa"/>
-          </w:tblCellMar>
-        </w:tblPrEx>
         <w:trPr>
           <w:cantSplit/>
         </w:trPr>
@@ -2605,12 +2530,6 @@
         </w:tc>
       </w:tr>
       <w:tr>
-        <w:tblPrEx>
-          <w:tblCellMar>
-            <w:top w:w="0" w:type="dxa"/>
-            <w:bottom w:w="0" w:type="dxa"/>
-          </w:tblCellMar>
-        </w:tblPrEx>
         <w:trPr>
           <w:cantSplit/>
         </w:trPr>
@@ -2678,12 +2597,6 @@
         </w:tc>
       </w:tr>
       <w:tr>
-        <w:tblPrEx>
-          <w:tblCellMar>
-            <w:top w:w="0" w:type="dxa"/>
-            <w:bottom w:w="0" w:type="dxa"/>
-          </w:tblCellMar>
-        </w:tblPrEx>
         <w:trPr>
           <w:cantSplit/>
         </w:trPr>
@@ -2749,12 +2662,6 @@
         </w:tc>
       </w:tr>
       <w:tr>
-        <w:tblPrEx>
-          <w:tblCellMar>
-            <w:top w:w="0" w:type="dxa"/>
-            <w:bottom w:w="0" w:type="dxa"/>
-          </w:tblCellMar>
-        </w:tblPrEx>
         <w:trPr>
           <w:cantSplit/>
         </w:trPr>
@@ -2822,12 +2729,6 @@
         </w:tc>
       </w:tr>
       <w:tr>
-        <w:tblPrEx>
-          <w:tblCellMar>
-            <w:top w:w="0" w:type="dxa"/>
-            <w:bottom w:w="0" w:type="dxa"/>
-          </w:tblCellMar>
-        </w:tblPrEx>
         <w:trPr>
           <w:cantSplit/>
         </w:trPr>
@@ -2894,12 +2795,6 @@
         </w:tc>
       </w:tr>
       <w:tr>
-        <w:tblPrEx>
-          <w:tblCellMar>
-            <w:top w:w="0" w:type="dxa"/>
-            <w:bottom w:w="0" w:type="dxa"/>
-          </w:tblCellMar>
-        </w:tblPrEx>
         <w:trPr>
           <w:cantSplit/>
         </w:trPr>
@@ -2967,12 +2862,6 @@
         </w:tc>
       </w:tr>
       <w:tr>
-        <w:tblPrEx>
-          <w:tblCellMar>
-            <w:top w:w="0" w:type="dxa"/>
-            <w:bottom w:w="0" w:type="dxa"/>
-          </w:tblCellMar>
-        </w:tblPrEx>
         <w:trPr>
           <w:cantSplit/>
         </w:trPr>
@@ -3038,12 +2927,6 @@
         </w:tc>
       </w:tr>
       <w:tr>
-        <w:tblPrEx>
-          <w:tblCellMar>
-            <w:top w:w="0" w:type="dxa"/>
-            <w:bottom w:w="0" w:type="dxa"/>
-          </w:tblCellMar>
-        </w:tblPrEx>
         <w:trPr>
           <w:cantSplit/>
         </w:trPr>
@@ -3111,12 +2994,6 @@
         </w:tc>
       </w:tr>
       <w:tr>
-        <w:tblPrEx>
-          <w:tblCellMar>
-            <w:top w:w="0" w:type="dxa"/>
-            <w:bottom w:w="0" w:type="dxa"/>
-          </w:tblCellMar>
-        </w:tblPrEx>
         <w:trPr>
           <w:cantSplit/>
         </w:trPr>
@@ -3182,12 +3059,6 @@
         </w:tc>
       </w:tr>
       <w:tr>
-        <w:tblPrEx>
-          <w:tblCellMar>
-            <w:top w:w="0" w:type="dxa"/>
-            <w:bottom w:w="0" w:type="dxa"/>
-          </w:tblCellMar>
-        </w:tblPrEx>
         <w:trPr>
           <w:cantSplit/>
         </w:trPr>
@@ -3255,12 +3126,6 @@
         </w:tc>
       </w:tr>
       <w:tr>
-        <w:tblPrEx>
-          <w:tblCellMar>
-            <w:top w:w="0" w:type="dxa"/>
-            <w:bottom w:w="0" w:type="dxa"/>
-          </w:tblCellMar>
-        </w:tblPrEx>
         <w:trPr>
           <w:cantSplit/>
         </w:trPr>
@@ -3342,12 +3207,6 @@
         </w:tc>
       </w:tr>
       <w:tr>
-        <w:tblPrEx>
-          <w:tblCellMar>
-            <w:top w:w="0" w:type="dxa"/>
-            <w:bottom w:w="0" w:type="dxa"/>
-          </w:tblCellMar>
-        </w:tblPrEx>
         <w:trPr>
           <w:cantSplit/>
         </w:trPr>
@@ -3706,12 +3565,6 @@
         <w:gridCol w:w="7360"/>
       </w:tblGrid>
       <w:tr>
-        <w:tblPrEx>
-          <w:tblCellMar>
-            <w:top w:w="0" w:type="dxa"/>
-            <w:bottom w:w="0" w:type="dxa"/>
-          </w:tblCellMar>
-        </w:tblPrEx>
         <w:trPr>
           <w:cantSplit/>
           <w:tblHeader/>
@@ -3786,12 +3639,6 @@
         </w:tc>
       </w:tr>
       <w:tr>
-        <w:tblPrEx>
-          <w:tblCellMar>
-            <w:top w:w="0" w:type="dxa"/>
-            <w:bottom w:w="0" w:type="dxa"/>
-          </w:tblCellMar>
-        </w:tblPrEx>
         <w:trPr>
           <w:cantSplit/>
         </w:trPr>
@@ -3857,12 +3704,6 @@
         </w:tc>
       </w:tr>
       <w:tr>
-        <w:tblPrEx>
-          <w:tblCellMar>
-            <w:top w:w="0" w:type="dxa"/>
-            <w:bottom w:w="0" w:type="dxa"/>
-          </w:tblCellMar>
-        </w:tblPrEx>
         <w:trPr>
           <w:cantSplit/>
         </w:trPr>
@@ -3930,12 +3771,6 @@
         </w:tc>
       </w:tr>
       <w:tr>
-        <w:tblPrEx>
-          <w:tblCellMar>
-            <w:top w:w="0" w:type="dxa"/>
-            <w:bottom w:w="0" w:type="dxa"/>
-          </w:tblCellMar>
-        </w:tblPrEx>
         <w:trPr>
           <w:cantSplit/>
         </w:trPr>
@@ -4001,12 +3836,6 @@
         </w:tc>
       </w:tr>
       <w:tr>
-        <w:tblPrEx>
-          <w:tblCellMar>
-            <w:top w:w="0" w:type="dxa"/>
-            <w:bottom w:w="0" w:type="dxa"/>
-          </w:tblCellMar>
-        </w:tblPrEx>
         <w:trPr>
           <w:cantSplit/>
         </w:trPr>
@@ -4114,12 +3943,6 @@
         <w:gridCol w:w="6760"/>
       </w:tblGrid>
       <w:tr>
-        <w:tblPrEx>
-          <w:tblCellMar>
-            <w:top w:w="0" w:type="dxa"/>
-            <w:bottom w:w="0" w:type="dxa"/>
-          </w:tblCellMar>
-        </w:tblPrEx>
         <w:trPr>
           <w:cantSplit/>
           <w:tblHeader/>
@@ -4194,12 +4017,6 @@
         </w:tc>
       </w:tr>
       <w:tr>
-        <w:tblPrEx>
-          <w:tblCellMar>
-            <w:top w:w="0" w:type="dxa"/>
-            <w:bottom w:w="0" w:type="dxa"/>
-          </w:tblCellMar>
-        </w:tblPrEx>
         <w:trPr>
           <w:cantSplit/>
         </w:trPr>
@@ -4265,12 +4082,6 @@
         </w:tc>
       </w:tr>
       <w:tr>
-        <w:tblPrEx>
-          <w:tblCellMar>
-            <w:top w:w="0" w:type="dxa"/>
-            <w:bottom w:w="0" w:type="dxa"/>
-          </w:tblCellMar>
-        </w:tblPrEx>
         <w:trPr>
           <w:cantSplit/>
         </w:trPr>
@@ -4338,12 +4149,6 @@
         </w:tc>
       </w:tr>
       <w:tr>
-        <w:tblPrEx>
-          <w:tblCellMar>
-            <w:top w:w="0" w:type="dxa"/>
-            <w:bottom w:w="0" w:type="dxa"/>
-          </w:tblCellMar>
-        </w:tblPrEx>
         <w:trPr>
           <w:cantSplit/>
         </w:trPr>
@@ -4409,12 +4214,6 @@
         </w:tc>
       </w:tr>
       <w:tr>
-        <w:tblPrEx>
-          <w:tblCellMar>
-            <w:top w:w="0" w:type="dxa"/>
-            <w:bottom w:w="0" w:type="dxa"/>
-          </w:tblCellMar>
-        </w:tblPrEx>
         <w:trPr>
           <w:cantSplit/>
         </w:trPr>
@@ -4482,12 +4281,6 @@
         </w:tc>
       </w:tr>
       <w:tr>
-        <w:tblPrEx>
-          <w:tblCellMar>
-            <w:top w:w="0" w:type="dxa"/>
-            <w:bottom w:w="0" w:type="dxa"/>
-          </w:tblCellMar>
-        </w:tblPrEx>
         <w:trPr>
           <w:cantSplit/>
         </w:trPr>
@@ -4701,12 +4494,6 @@
         <w:gridCol w:w="6000"/>
       </w:tblGrid>
       <w:tr>
-        <w:tblPrEx>
-          <w:tblCellMar>
-            <w:top w:w="0" w:type="dxa"/>
-            <w:bottom w:w="0" w:type="dxa"/>
-          </w:tblCellMar>
-        </w:tblPrEx>
         <w:trPr>
           <w:cantSplit/>
           <w:tblHeader/>
@@ -4815,12 +4602,6 @@
         </w:tc>
       </w:tr>
       <w:tr>
-        <w:tblPrEx>
-          <w:tblCellMar>
-            <w:top w:w="0" w:type="dxa"/>
-            <w:bottom w:w="0" w:type="dxa"/>
-          </w:tblCellMar>
-        </w:tblPrEx>
         <w:trPr>
           <w:cantSplit/>
         </w:trPr>
@@ -4916,12 +4697,6 @@
         </w:tc>
       </w:tr>
       <w:tr>
-        <w:tblPrEx>
-          <w:tblCellMar>
-            <w:top w:w="0" w:type="dxa"/>
-            <w:bottom w:w="0" w:type="dxa"/>
-          </w:tblCellMar>
-        </w:tblPrEx>
         <w:trPr>
           <w:cantSplit/>
         </w:trPr>
@@ -5020,12 +4795,6 @@
         </w:tc>
       </w:tr>
       <w:tr>
-        <w:tblPrEx>
-          <w:tblCellMar>
-            <w:top w:w="0" w:type="dxa"/>
-            <w:bottom w:w="0" w:type="dxa"/>
-          </w:tblCellMar>
-        </w:tblPrEx>
         <w:trPr>
           <w:cantSplit/>
         </w:trPr>
@@ -5121,12 +4890,6 @@
         </w:tc>
       </w:tr>
       <w:tr>
-        <w:tblPrEx>
-          <w:tblCellMar>
-            <w:top w:w="0" w:type="dxa"/>
-            <w:bottom w:w="0" w:type="dxa"/>
-          </w:tblCellMar>
-        </w:tblPrEx>
         <w:trPr>
           <w:cantSplit/>
         </w:trPr>
@@ -5350,12 +5113,6 @@
         <w:gridCol w:w="6000"/>
       </w:tblGrid>
       <w:tr>
-        <w:tblPrEx>
-          <w:tblCellMar>
-            <w:top w:w="0" w:type="dxa"/>
-            <w:bottom w:w="0" w:type="dxa"/>
-          </w:tblCellMar>
-        </w:tblPrEx>
         <w:trPr>
           <w:cantSplit/>
           <w:tblHeader/>
@@ -5464,12 +5221,6 @@
         </w:tc>
       </w:tr>
       <w:tr>
-        <w:tblPrEx>
-          <w:tblCellMar>
-            <w:top w:w="0" w:type="dxa"/>
-            <w:bottom w:w="0" w:type="dxa"/>
-          </w:tblCellMar>
-        </w:tblPrEx>
         <w:trPr>
           <w:cantSplit/>
         </w:trPr>
@@ -5565,12 +5316,6 @@
         </w:tc>
       </w:tr>
       <w:tr>
-        <w:tblPrEx>
-          <w:tblCellMar>
-            <w:top w:w="0" w:type="dxa"/>
-            <w:bottom w:w="0" w:type="dxa"/>
-          </w:tblCellMar>
-        </w:tblPrEx>
         <w:trPr>
           <w:cantSplit/>
         </w:trPr>
@@ -5669,12 +5414,6 @@
         </w:tc>
       </w:tr>
       <w:tr>
-        <w:tblPrEx>
-          <w:tblCellMar>
-            <w:top w:w="0" w:type="dxa"/>
-            <w:bottom w:w="0" w:type="dxa"/>
-          </w:tblCellMar>
-        </w:tblPrEx>
         <w:trPr>
           <w:cantSplit/>
         </w:trPr>
@@ -5770,12 +5509,6 @@
         </w:tc>
       </w:tr>
       <w:tr>
-        <w:tblPrEx>
-          <w:tblCellMar>
-            <w:top w:w="0" w:type="dxa"/>
-            <w:bottom w:w="0" w:type="dxa"/>
-          </w:tblCellMar>
-        </w:tblPrEx>
         <w:trPr>
           <w:cantSplit/>
         </w:trPr>
@@ -5890,12 +5623,6 @@
         </w:tc>
       </w:tr>
       <w:tr>
-        <w:tblPrEx>
-          <w:tblCellMar>
-            <w:top w:w="0" w:type="dxa"/>
-            <w:bottom w:w="0" w:type="dxa"/>
-          </w:tblCellMar>
-        </w:tblPrEx>
         <w:trPr>
           <w:cantSplit/>
         </w:trPr>
@@ -6197,12 +5924,6 @@
         <w:gridCol w:w="6000"/>
       </w:tblGrid>
       <w:tr>
-        <w:tblPrEx>
-          <w:tblCellMar>
-            <w:top w:w="0" w:type="dxa"/>
-            <w:bottom w:w="0" w:type="dxa"/>
-          </w:tblCellMar>
-        </w:tblPrEx>
         <w:trPr>
           <w:cantSplit/>
           <w:tblHeader/>
@@ -6311,12 +6032,6 @@
         </w:tc>
       </w:tr>
       <w:tr>
-        <w:tblPrEx>
-          <w:tblCellMar>
-            <w:top w:w="0" w:type="dxa"/>
-            <w:bottom w:w="0" w:type="dxa"/>
-          </w:tblCellMar>
-        </w:tblPrEx>
         <w:trPr>
           <w:cantSplit/>
         </w:trPr>
@@ -6412,12 +6127,6 @@
         </w:tc>
       </w:tr>
       <w:tr>
-        <w:tblPrEx>
-          <w:tblCellMar>
-            <w:top w:w="0" w:type="dxa"/>
-            <w:bottom w:w="0" w:type="dxa"/>
-          </w:tblCellMar>
-        </w:tblPrEx>
         <w:trPr>
           <w:cantSplit/>
         </w:trPr>
@@ -6680,12 +6389,6 @@
         <w:gridCol w:w="6960"/>
       </w:tblGrid>
       <w:tr>
-        <w:tblPrEx>
-          <w:tblCellMar>
-            <w:top w:w="0" w:type="dxa"/>
-            <w:bottom w:w="0" w:type="dxa"/>
-          </w:tblCellMar>
-        </w:tblPrEx>
         <w:trPr>
           <w:cantSplit/>
           <w:tblHeader/>
@@ -6760,12 +6463,6 @@
         </w:tc>
       </w:tr>
       <w:tr>
-        <w:tblPrEx>
-          <w:tblCellMar>
-            <w:top w:w="0" w:type="dxa"/>
-            <w:bottom w:w="0" w:type="dxa"/>
-          </w:tblCellMar>
-        </w:tblPrEx>
         <w:trPr>
           <w:cantSplit/>
         </w:trPr>
@@ -6831,12 +6528,6 @@
         </w:tc>
       </w:tr>
       <w:tr>
-        <w:tblPrEx>
-          <w:tblCellMar>
-            <w:top w:w="0" w:type="dxa"/>
-            <w:bottom w:w="0" w:type="dxa"/>
-          </w:tblCellMar>
-        </w:tblPrEx>
         <w:trPr>
           <w:cantSplit/>
         </w:trPr>
@@ -6904,12 +6595,6 @@
         </w:tc>
       </w:tr>
       <w:tr>
-        <w:tblPrEx>
-          <w:tblCellMar>
-            <w:top w:w="0" w:type="dxa"/>
-            <w:bottom w:w="0" w:type="dxa"/>
-          </w:tblCellMar>
-        </w:tblPrEx>
         <w:trPr>
           <w:cantSplit/>
         </w:trPr>
@@ -6975,12 +6660,6 @@
         </w:tc>
       </w:tr>
       <w:tr>
-        <w:tblPrEx>
-          <w:tblCellMar>
-            <w:top w:w="0" w:type="dxa"/>
-            <w:bottom w:w="0" w:type="dxa"/>
-          </w:tblCellMar>
-        </w:tblPrEx>
         <w:trPr>
           <w:cantSplit/>
         </w:trPr>
@@ -7125,12 +6804,6 @@
         <w:gridCol w:w="6960"/>
       </w:tblGrid>
       <w:tr>
-        <w:tblPrEx>
-          <w:tblCellMar>
-            <w:top w:w="0" w:type="dxa"/>
-            <w:bottom w:w="0" w:type="dxa"/>
-          </w:tblCellMar>
-        </w:tblPrEx>
         <w:trPr>
           <w:cantSplit/>
           <w:tblHeader/>
@@ -7205,12 +6878,6 @@
         </w:tc>
       </w:tr>
       <w:tr>
-        <w:tblPrEx>
-          <w:tblCellMar>
-            <w:top w:w="0" w:type="dxa"/>
-            <w:bottom w:w="0" w:type="dxa"/>
-          </w:tblCellMar>
-        </w:tblPrEx>
         <w:trPr>
           <w:cantSplit/>
         </w:trPr>
@@ -7292,12 +6959,6 @@
         </w:tc>
       </w:tr>
       <w:tr>
-        <w:tblPrEx>
-          <w:tblCellMar>
-            <w:top w:w="0" w:type="dxa"/>
-            <w:bottom w:w="0" w:type="dxa"/>
-          </w:tblCellMar>
-        </w:tblPrEx>
         <w:trPr>
           <w:cantSplit/>
         </w:trPr>
@@ -7431,12 +7092,6 @@
         <w:gridCol w:w="2600"/>
       </w:tblGrid>
       <w:tr>
-        <w:tblPrEx>
-          <w:tblCellMar>
-            <w:top w:w="0" w:type="dxa"/>
-            <w:bottom w:w="0" w:type="dxa"/>
-          </w:tblCellMar>
-        </w:tblPrEx>
         <w:trPr>
           <w:cantSplit/>
           <w:tblHeader/>
@@ -7545,12 +7200,6 @@
         </w:tc>
       </w:tr>
       <w:tr>
-        <w:tblPrEx>
-          <w:tblCellMar>
-            <w:top w:w="0" w:type="dxa"/>
-            <w:bottom w:w="0" w:type="dxa"/>
-          </w:tblCellMar>
-        </w:tblPrEx>
         <w:trPr>
           <w:cantSplit/>
         </w:trPr>
@@ -7646,12 +7295,6 @@
         </w:tc>
       </w:tr>
       <w:tr>
-        <w:tblPrEx>
-          <w:tblCellMar>
-            <w:top w:w="0" w:type="dxa"/>
-            <w:bottom w:w="0" w:type="dxa"/>
-          </w:tblCellMar>
-        </w:tblPrEx>
         <w:trPr>
           <w:cantSplit/>
         </w:trPr>
@@ -7750,12 +7393,6 @@
         </w:tc>
       </w:tr>
       <w:tr>
-        <w:tblPrEx>
-          <w:tblCellMar>
-            <w:top w:w="0" w:type="dxa"/>
-            <w:bottom w:w="0" w:type="dxa"/>
-          </w:tblCellMar>
-        </w:tblPrEx>
         <w:trPr>
           <w:cantSplit/>
         </w:trPr>
@@ -7851,12 +7488,6 @@
         </w:tc>
       </w:tr>
       <w:tr>
-        <w:tblPrEx>
-          <w:tblCellMar>
-            <w:top w:w="0" w:type="dxa"/>
-            <w:bottom w:w="0" w:type="dxa"/>
-          </w:tblCellMar>
-        </w:tblPrEx>
         <w:trPr>
           <w:cantSplit/>
         </w:trPr>
@@ -7955,12 +7586,6 @@
         </w:tc>
       </w:tr>
       <w:tr>
-        <w:tblPrEx>
-          <w:tblCellMar>
-            <w:top w:w="0" w:type="dxa"/>
-            <w:bottom w:w="0" w:type="dxa"/>
-          </w:tblCellMar>
-        </w:tblPrEx>
         <w:trPr>
           <w:cantSplit/>
         </w:trPr>
@@ -8056,12 +7681,6 @@
         </w:tc>
       </w:tr>
       <w:tr>
-        <w:tblPrEx>
-          <w:tblCellMar>
-            <w:top w:w="0" w:type="dxa"/>
-            <w:bottom w:w="0" w:type="dxa"/>
-          </w:tblCellMar>
-        </w:tblPrEx>
         <w:trPr>
           <w:cantSplit/>
         </w:trPr>
@@ -8160,12 +7779,6 @@
         </w:tc>
       </w:tr>
       <w:tr>
-        <w:tblPrEx>
-          <w:tblCellMar>
-            <w:top w:w="0" w:type="dxa"/>
-            <w:bottom w:w="0" w:type="dxa"/>
-          </w:tblCellMar>
-        </w:tblPrEx>
         <w:trPr>
           <w:cantSplit/>
         </w:trPr>
@@ -8261,12 +7874,6 @@
         </w:tc>
       </w:tr>
       <w:tr>
-        <w:tblPrEx>
-          <w:tblCellMar>
-            <w:top w:w="0" w:type="dxa"/>
-            <w:bottom w:w="0" w:type="dxa"/>
-          </w:tblCellMar>
-        </w:tblPrEx>
         <w:trPr>
           <w:cantSplit/>
         </w:trPr>
@@ -8365,12 +7972,6 @@
         </w:tc>
       </w:tr>
       <w:tr>
-        <w:tblPrEx>
-          <w:tblCellMar>
-            <w:top w:w="0" w:type="dxa"/>
-            <w:bottom w:w="0" w:type="dxa"/>
-          </w:tblCellMar>
-        </w:tblPrEx>
         <w:trPr>
           <w:cantSplit/>
         </w:trPr>
@@ -8649,12 +8250,6 @@
         <w:gridCol w:w="1800"/>
       </w:tblGrid>
       <w:tr>
-        <w:tblPrEx>
-          <w:tblCellMar>
-            <w:top w:w="0" w:type="dxa"/>
-            <w:bottom w:w="0" w:type="dxa"/>
-          </w:tblCellMar>
-        </w:tblPrEx>
         <w:trPr>
           <w:cantSplit/>
           <w:tblHeader/>
@@ -8797,12 +8392,6 @@
         </w:tc>
       </w:tr>
       <w:tr>
-        <w:tblPrEx>
-          <w:tblCellMar>
-            <w:top w:w="0" w:type="dxa"/>
-            <w:bottom w:w="0" w:type="dxa"/>
-          </w:tblCellMar>
-        </w:tblPrEx>
         <w:trPr>
           <w:cantSplit/>
         </w:trPr>

</xml_diff>